<commit_message>
Render Mermaid a PNG + capturas embebidas en PDF/DOCX (4 diagramas) + 4 graficas resultados
</commit_message>
<xml_diff>
--- a/informe/Tarea3_grupo.docx
+++ b/informe/Tarea3_grupo.docx
@@ -1964,6 +1964,57 @@
     </w:p>
     <w:p>
       <w:pPr>
+        <w:jc w:val="center"/>
+      </w:pPr>
+      <w:r>
+        <w:drawing>
+          <wp:inline xmlns:a="http://schemas.openxmlformats.org/drawingml/2006/main" xmlns:pic="http://schemas.openxmlformats.org/drawingml/2006/picture">
+            <wp:extent cx="5029200" cy="1238056"/>
+            <wp:docPr id="5" name="Picture 5"/>
+            <wp:cNvGraphicFramePr>
+              <a:graphicFrameLocks noChangeAspect="1"/>
+            </wp:cNvGraphicFramePr>
+            <a:graphic>
+              <a:graphicData uri="http://schemas.openxmlformats.org/drawingml/2006/picture">
+                <pic:pic>
+                  <pic:nvPicPr>
+                    <pic:cNvPr id="0" name="diagram1.png"/>
+                    <pic:cNvPicPr/>
+                  </pic:nvPicPr>
+                  <pic:blipFill>
+                    <a:blip r:embed="rId15"/>
+                    <a:stretch>
+                      <a:fillRect/>
+                    </a:stretch>
+                  </pic:blipFill>
+                  <pic:spPr>
+                    <a:xfrm>
+                      <a:off x="0" y="0"/>
+                      <a:ext cx="5029200" cy="1238056"/>
+                    </a:xfrm>
+                    <a:prstGeom prst="rect"/>
+                  </pic:spPr>
+                </pic:pic>
+              </a:graphicData>
+            </a:graphic>
+          </wp:inline>
+        </w:drawing>
+      </w:r>
+    </w:p>
+    <w:p>
+      <w:pPr>
+        <w:jc w:val="center"/>
+      </w:pPr>
+      <w:r>
+        <w:rPr>
+          <w:i/>
+          <w:sz w:val="13"/>
+        </w:rPr>
+        <w:t>Captura renderizada - Arquitectura Kafka + Spark</w:t>
+      </w:r>
+    </w:p>
+    <w:p>
+      <w:pPr>
         <w:pStyle w:val="ListBullet"/>
         <w:spacing w:after="40"/>
         <w:ind w:left="360"/>
@@ -2189,6 +2240,57 @@
     </w:p>
     <w:p>
       <w:pPr>
+        <w:jc w:val="center"/>
+      </w:pPr>
+      <w:r>
+        <w:drawing>
+          <wp:inline xmlns:a="http://schemas.openxmlformats.org/drawingml/2006/main" xmlns:pic="http://schemas.openxmlformats.org/drawingml/2006/picture">
+            <wp:extent cx="5029200" cy="14021560"/>
+            <wp:docPr id="6" name="Picture 6"/>
+            <wp:cNvGraphicFramePr>
+              <a:graphicFrameLocks noChangeAspect="1"/>
+            </wp:cNvGraphicFramePr>
+            <a:graphic>
+              <a:graphicData uri="http://schemas.openxmlformats.org/drawingml/2006/picture">
+                <pic:pic>
+                  <pic:nvPicPr>
+                    <pic:cNvPr id="0" name="diagram2.png"/>
+                    <pic:cNvPicPr/>
+                  </pic:nvPicPr>
+                  <pic:blipFill>
+                    <a:blip r:embed="rId16"/>
+                    <a:stretch>
+                      <a:fillRect/>
+                    </a:stretch>
+                  </pic:blipFill>
+                  <pic:spPr>
+                    <a:xfrm>
+                      <a:off x="0" y="0"/>
+                      <a:ext cx="5029200" cy="14021560"/>
+                    </a:xfrm>
+                    <a:prstGeom prst="rect"/>
+                  </pic:spPr>
+                </pic:pic>
+              </a:graphicData>
+            </a:graphic>
+          </wp:inline>
+        </w:drawing>
+      </w:r>
+    </w:p>
+    <w:p>
+      <w:pPr>
+        <w:jc w:val="center"/>
+      </w:pPr>
+      <w:r>
+        <w:rPr>
+          <w:i/>
+          <w:sz w:val="13"/>
+        </w:rPr>
+        <w:t>Captura renderizada - Flujo end-to-end</w:t>
+      </w:r>
+    </w:p>
+    <w:p>
+      <w:pPr>
         <w:pStyle w:val="Heading1"/>
         <w:spacing w:before="160" w:after="60"/>
         <w:pBdr>
@@ -2345,6 +2447,57 @@
           <w:sz w:val="13"/>
         </w:rPr>
         <w:t>Mermaid 3: Modelo entidad-relación dataset Calidad del Aire</w:t>
+      </w:r>
+    </w:p>
+    <w:p>
+      <w:pPr>
+        <w:jc w:val="center"/>
+      </w:pPr>
+      <w:r>
+        <w:drawing>
+          <wp:inline xmlns:a="http://schemas.openxmlformats.org/drawingml/2006/main" xmlns:pic="http://schemas.openxmlformats.org/drawingml/2006/picture">
+            <wp:extent cx="5029200" cy="17018241"/>
+            <wp:docPr id="7" name="Picture 7"/>
+            <wp:cNvGraphicFramePr>
+              <a:graphicFrameLocks noChangeAspect="1"/>
+            </wp:cNvGraphicFramePr>
+            <a:graphic>
+              <a:graphicData uri="http://schemas.openxmlformats.org/drawingml/2006/picture">
+                <pic:pic>
+                  <pic:nvPicPr>
+                    <pic:cNvPr id="0" name="diagram3.png"/>
+                    <pic:cNvPicPr/>
+                  </pic:nvPicPr>
+                  <pic:blipFill>
+                    <a:blip r:embed="rId17"/>
+                    <a:stretch>
+                      <a:fillRect/>
+                    </a:stretch>
+                  </pic:blipFill>
+                  <pic:spPr>
+                    <a:xfrm>
+                      <a:off x="0" y="0"/>
+                      <a:ext cx="5029200" cy="17018241"/>
+                    </a:xfrm>
+                    <a:prstGeom prst="rect"/>
+                  </pic:spPr>
+                </pic:pic>
+              </a:graphicData>
+            </a:graphic>
+          </wp:inline>
+        </w:drawing>
+      </w:r>
+    </w:p>
+    <w:p>
+      <w:pPr>
+        <w:jc w:val="center"/>
+      </w:pPr>
+      <w:r>
+        <w:rPr>
+          <w:i/>
+          <w:sz w:val="13"/>
+        </w:rPr>
+        <w:t>Captura renderizada - ER Calidad Aire</w:t>
       </w:r>
     </w:p>
     <w:p>
@@ -4059,6 +4212,57 @@
     </w:p>
     <w:p>
       <w:pPr>
+        <w:jc w:val="center"/>
+      </w:pPr>
+      <w:r>
+        <w:drawing>
+          <wp:inline xmlns:a="http://schemas.openxmlformats.org/drawingml/2006/main" xmlns:pic="http://schemas.openxmlformats.org/drawingml/2006/picture">
+            <wp:extent cx="5029200" cy="2392719"/>
+            <wp:docPr id="8" name="Picture 8"/>
+            <wp:cNvGraphicFramePr>
+              <a:graphicFrameLocks noChangeAspect="1"/>
+            </wp:cNvGraphicFramePr>
+            <a:graphic>
+              <a:graphicData uri="http://schemas.openxmlformats.org/drawingml/2006/picture">
+                <pic:pic>
+                  <pic:nvPicPr>
+                    <pic:cNvPr id="0" name="diagram4.png"/>
+                    <pic:cNvPicPr/>
+                  </pic:nvPicPr>
+                  <pic:blipFill>
+                    <a:blip r:embed="rId18"/>
+                    <a:stretch>
+                      <a:fillRect/>
+                    </a:stretch>
+                  </pic:blipFill>
+                  <pic:spPr>
+                    <a:xfrm>
+                      <a:off x="0" y="0"/>
+                      <a:ext cx="5029200" cy="2392719"/>
+                    </a:xfrm>
+                    <a:prstGeom prst="rect"/>
+                  </pic:spPr>
+                </pic:pic>
+              </a:graphicData>
+            </a:graphic>
+          </wp:inline>
+        </w:drawing>
+      </w:r>
+    </w:p>
+    <w:p>
+      <w:pPr>
+        <w:jc w:val="center"/>
+      </w:pPr>
+      <w:r>
+        <w:rPr>
+          <w:i/>
+          <w:sz w:val="13"/>
+        </w:rPr>
+        <w:t>Captura renderizada - Secuencia Streaming</w:t>
+      </w:r>
+    </w:p>
+    <w:p>
+      <w:pPr>
         <w:pStyle w:val="Heading1"/>
         <w:spacing w:before="160" w:after="60"/>
         <w:pBdr>

</xml_diff>